<commit_message>
fix: correct image dimensions in manuscript_main.docx
Updated EMU extents to match actual pixel dimensions of new figures
at 5.5-inch display width:
- Figure 1 (stratified): 5.50" x 2.14"
- Figure 2 (main scatter): 5.50" x 3.91"
- Supp Figure S1 (combined vertical): 5.50" x 6.95"

Co-Authored-By: Claude Sonnet 4.6 <noreply@anthropic.com>
</commit_message>
<xml_diff>
--- a/04_Manuscripts/submission_package/manuscript_main.docx
+++ b/04_Manuscripts/submission_package/manuscript_main.docx
@@ -4164,7 +4164,7 @@
         </w:rPr>
         <w:drawing>
           <wp:inline distT="0" distB="0" distL="0" distR="0" wp14:anchorId="5ABE46AD" wp14:editId="50AA3F41">
-            <wp:extent cx="5334000" cy="2072467"/>
+            <wp:extent cx="5029200" cy="1954040"/>
             <wp:effectExtent l="0" t="0" r="0" b="0"/>
             <wp:docPr id="58" name="Picture"/>
             <wp:cNvGraphicFramePr/>
@@ -4186,7 +4186,7 @@
                   <pic:spPr bwMode="auto">
                     <a:xfrm>
                       <a:off x="0" y="0"/>
-                      <a:ext cx="5334000" cy="2072467"/>
+                      <a:ext cx="5029200" cy="1954040"/>
                     </a:xfrm>
                     <a:prstGeom prst="rect">
                       <a:avLst/>
@@ -4225,7 +4225,7 @@
         </w:rPr>
         <w:drawing>
           <wp:inline distT="0" distB="0" distL="0" distR="0" wp14:anchorId="2E496ED7" wp14:editId="522DF9DB">
-            <wp:extent cx="5334000" cy="3793180"/>
+            <wp:extent cx="5029200" cy="3576427"/>
             <wp:effectExtent l="0" t="0" r="0" b="0"/>
             <wp:docPr id="62" name="Picture"/>
             <wp:cNvGraphicFramePr/>
@@ -4247,7 +4247,7 @@
                   <pic:spPr bwMode="auto">
                     <a:xfrm>
                       <a:off x="0" y="0"/>
-                      <a:ext cx="5334000" cy="3793180"/>
+                      <a:ext cx="5029200" cy="3576427"/>
                     </a:xfrm>
                     <a:prstGeom prst="rect">
                       <a:avLst/>
@@ -4339,7 +4339,7 @@
         </w:rPr>
         <w:drawing>
           <wp:inline distT="0" distB="0" distL="0" distR="0" wp14:anchorId="03AEB071" wp14:editId="5FB38D34">
-            <wp:extent cx="5334000" cy="1636411"/>
+            <wp:extent cx="5029200" cy="6353539"/>
             <wp:effectExtent l="0" t="0" r="0" b="0"/>
             <wp:docPr id="66" name="Picture"/>
             <wp:cNvGraphicFramePr/>
@@ -4361,7 +4361,7 @@
                   <pic:spPr bwMode="auto">
                     <a:xfrm>
                       <a:off x="0" y="0"/>
-                      <a:ext cx="5334000" cy="1636411"/>
+                      <a:ext cx="5029200" cy="6353539"/>
                     </a:xfrm>
                     <a:prstGeom prst="rect">
                       <a:avLst/>

</xml_diff>